<commit_message>
Filter top pages to Organic + AI Referrals only
</commit_message>
<xml_diff>
--- a/mql_q1q2_2026_report.docx
+++ b/mql_q1q2_2026_report.docx
@@ -2743,7 +2743,7 @@
           <w:color w:val="6B7280"/>
           <w:sz w:val="18"/>
         </w:rPr>
-        <w:t>Pages ranked by combined MQL + Opportunity count. Slug = path after openloyalty.io.</w:t>
+        <w:t>Organic Search + AI Referrals only. Slug = path after openloyalty.io.</w:t>
       </w:r>
     </w:p>
     <w:tbl>
@@ -2966,7 +2966,7 @@
                 <w:color w:val="1A56DB"/>
                 <w:sz w:val="17"/>
               </w:rPr>
-              <w:t>108</w:t>
+              <w:t>54</w:t>
             </w:r>
           </w:p>
         </w:tc>
@@ -2993,7 +2993,7 @@
                 <w:color w:val="057A55"/>
                 <w:sz w:val="17"/>
               </w:rPr>
-              <w:t>125</w:t>
+              <w:t>77</w:t>
             </w:r>
           </w:p>
         </w:tc>
@@ -3047,7 +3047,7 @@
                 <w:color w:val="111827"/>
                 <w:sz w:val="17"/>
               </w:rPr>
-              <w:t>233</w:t>
+              <w:t>131</w:t>
             </w:r>
           </w:p>
         </w:tc>
@@ -3103,7 +3103,7 @@
                 <w:color w:val="111827"/>
                 <w:sz w:val="17"/>
               </w:rPr>
-              <w:t>/pricing</w:t>
+              <w:t>/es</w:t>
             </w:r>
           </w:p>
         </w:tc>
@@ -3130,7 +3130,7 @@
                 <w:color w:val="1A56DB"/>
                 <w:sz w:val="17"/>
               </w:rPr>
-              <w:t>20</w:t>
+              <w:t>9</w:t>
             </w:r>
           </w:p>
         </w:tc>
@@ -3157,7 +3157,7 @@
                 <w:color w:val="057A55"/>
                 <w:sz w:val="17"/>
               </w:rPr>
-              <w:t>11</w:t>
+              <w:t>5</w:t>
             </w:r>
           </w:p>
         </w:tc>
@@ -3211,7 +3211,7 @@
                 <w:color w:val="111827"/>
                 <w:sz w:val="17"/>
               </w:rPr>
-              <w:t>31</w:t>
+              <w:t>14</w:t>
             </w:r>
           </w:p>
         </w:tc>
@@ -3267,7 +3267,7 @@
                 <w:color w:val="111827"/>
                 <w:sz w:val="17"/>
               </w:rPr>
-              <w:t>/book-a-demo-contact</w:t>
+              <w:t>/insider/best-loyalty-software-comparison-guide</w:t>
             </w:r>
           </w:p>
         </w:tc>
@@ -3294,7 +3294,7 @@
                 <w:color w:val="1A56DB"/>
                 <w:sz w:val="17"/>
               </w:rPr>
-              <w:t>9</w:t>
+              <w:t>7</w:t>
             </w:r>
           </w:p>
         </w:tc>
@@ -3321,7 +3321,7 @@
                 <w:color w:val="057A55"/>
                 <w:sz w:val="17"/>
               </w:rPr>
-              <w:t>20</w:t>
+              <w:t>4</w:t>
             </w:r>
           </w:p>
         </w:tc>
@@ -3375,7 +3375,7 @@
                 <w:color w:val="111827"/>
                 <w:sz w:val="17"/>
               </w:rPr>
-              <w:t>29</w:t>
+              <w:t>11</w:t>
             </w:r>
           </w:p>
         </w:tc>
@@ -3431,7 +3431,7 @@
                 <w:color w:val="111827"/>
                 <w:sz w:val="17"/>
               </w:rPr>
-              <w:t>/es</w:t>
+              <w:t>/applications/white-label-loyalty</w:t>
             </w:r>
           </w:p>
         </w:tc>
@@ -3458,7 +3458,7 @@
                 <w:color w:val="1A56DB"/>
                 <w:sz w:val="17"/>
               </w:rPr>
-              <w:t>9</w:t>
+              <w:t>7</w:t>
             </w:r>
           </w:p>
         </w:tc>
@@ -3485,7 +3485,7 @@
                 <w:color w:val="057A55"/>
                 <w:sz w:val="17"/>
               </w:rPr>
-              <w:t>7</w:t>
+              <w:t>4</w:t>
             </w:r>
           </w:p>
         </w:tc>
@@ -3539,7 +3539,7 @@
                 <w:color w:val="111827"/>
                 <w:sz w:val="17"/>
               </w:rPr>
-              <w:t>16</w:t>
+              <w:t>11</w:t>
             </w:r>
           </w:p>
         </w:tc>
@@ -3595,7 +3595,7 @@
                 <w:color w:val="111827"/>
                 <w:sz w:val="17"/>
               </w:rPr>
-              <w:t>/applications/white-label-loyalty</w:t>
+              <w:t>/pricing</w:t>
             </w:r>
           </w:p>
         </w:tc>
@@ -3622,7 +3622,7 @@
                 <w:color w:val="1A56DB"/>
                 <w:sz w:val="17"/>
               </w:rPr>
-              <w:t>11</w:t>
+              <w:t>5</w:t>
             </w:r>
           </w:p>
         </w:tc>
@@ -3649,7 +3649,7 @@
                 <w:color w:val="057A55"/>
                 <w:sz w:val="17"/>
               </w:rPr>
-              <w:t>4</w:t>
+              <w:t>5</w:t>
             </w:r>
           </w:p>
         </w:tc>
@@ -3703,7 +3703,7 @@
                 <w:color w:val="111827"/>
                 <w:sz w:val="17"/>
               </w:rPr>
-              <w:t>15</w:t>
+              <w:t>10</w:t>
             </w:r>
           </w:p>
         </w:tc>
@@ -3759,7 +3759,7 @@
                 <w:color w:val="111827"/>
                 <w:sz w:val="17"/>
               </w:rPr>
-              <w:t>/insider/best-loyalty-software-comparison-guide</w:t>
+              <w:t>/technology/loyalty-program-api</w:t>
             </w:r>
           </w:p>
         </w:tc>
@@ -3786,7 +3786,7 @@
                 <w:color w:val="1A56DB"/>
                 <w:sz w:val="17"/>
               </w:rPr>
-              <w:t>8</w:t>
+              <w:t>5</w:t>
             </w:r>
           </w:p>
         </w:tc>
@@ -3867,7 +3867,7 @@
                 <w:color w:val="111827"/>
                 <w:sz w:val="17"/>
               </w:rPr>
-              <w:t>12</w:t>
+              <w:t>9</w:t>
             </w:r>
           </w:p>
         </w:tc>
@@ -3923,7 +3923,7 @@
                 <w:color w:val="111827"/>
                 <w:sz w:val="17"/>
               </w:rPr>
-              <w:t>/technology/loyalty-program-api</w:t>
+              <w:t>/insider/coupon-management-software</w:t>
             </w:r>
           </w:p>
         </w:tc>
@@ -3950,7 +3950,7 @@
                 <w:color w:val="1A56DB"/>
                 <w:sz w:val="17"/>
               </w:rPr>
-              <w:t>6</w:t>
+              <w:t>1</w:t>
             </w:r>
           </w:p>
         </w:tc>
@@ -3977,7 +3977,7 @@
                 <w:color w:val="057A55"/>
                 <w:sz w:val="17"/>
               </w:rPr>
-              <w:t>4</w:t>
+              <w:t>3</w:t>
             </w:r>
           </w:p>
         </w:tc>
@@ -4031,7 +4031,7 @@
                 <w:color w:val="111827"/>
                 <w:sz w:val="17"/>
               </w:rPr>
-              <w:t>10</w:t>
+              <w:t>4</w:t>
             </w:r>
           </w:p>
         </w:tc>
@@ -4087,7 +4087,7 @@
                 <w:color w:val="111827"/>
                 <w:sz w:val="17"/>
               </w:rPr>
-              <w:t>/product/loyalty-card-system</w:t>
+              <w:t>/resources/10-best-gamification-loyalty-programs</w:t>
             </w:r>
           </w:p>
         </w:tc>
@@ -4111,10 +4111,10 @@
             <w:r>
               <w:rPr>
                 <w:b w:val="0"/>
-                <w:color w:val="1A56DB"/>
-                <w:sz w:val="17"/>
-              </w:rPr>
-              <w:t>2</w:t>
+                <w:color w:val="6B7280"/>
+                <w:sz w:val="17"/>
+              </w:rPr>
+              <w:t>0</w:t>
             </w:r>
           </w:p>
         </w:tc>
@@ -4141,7 +4141,7 @@
                 <w:color w:val="057A55"/>
                 <w:sz w:val="17"/>
               </w:rPr>
-              <w:t>2</w:t>
+              <w:t>4</w:t>
             </w:r>
           </w:p>
         </w:tc>
@@ -4251,7 +4251,7 @@
                 <w:color w:val="111827"/>
                 <w:sz w:val="17"/>
               </w:rPr>
-              <w:t>/resources/10-best-gamification-loyalty-programs</w:t>
+              <w:t>/product/vouchers</w:t>
             </w:r>
           </w:p>
         </w:tc>
@@ -4275,10 +4275,10 @@
             <w:r>
               <w:rPr>
                 <w:b w:val="0"/>
-                <w:color w:val="6B7280"/>
-                <w:sz w:val="17"/>
-              </w:rPr>
-              <w:t>0</w:t>
+                <w:color w:val="1A56DB"/>
+                <w:sz w:val="17"/>
+              </w:rPr>
+              <w:t>1</w:t>
             </w:r>
           </w:p>
         </w:tc>
@@ -4305,7 +4305,7 @@
                 <w:color w:val="057A55"/>
                 <w:sz w:val="17"/>
               </w:rPr>
-              <w:t>4</w:t>
+              <w:t>2</w:t>
             </w:r>
           </w:p>
         </w:tc>
@@ -4359,7 +4359,7 @@
                 <w:color w:val="111827"/>
                 <w:sz w:val="17"/>
               </w:rPr>
-              <w:t>4</w:t>
+              <w:t>3</w:t>
             </w:r>
           </w:p>
         </w:tc>
@@ -4415,7 +4415,7 @@
                 <w:color w:val="111827"/>
                 <w:sz w:val="17"/>
               </w:rPr>
-              <w:t>/product/loyalty-points-system</w:t>
+              <w:t>/applications/saas-enrichment</w:t>
             </w:r>
           </w:p>
         </w:tc>
@@ -4442,7 +4442,7 @@
                 <w:color w:val="1A56DB"/>
                 <w:sz w:val="17"/>
               </w:rPr>
-              <w:t>2</w:t>
+              <w:t>1</w:t>
             </w:r>
           </w:p>
         </w:tc>
@@ -4469,7 +4469,7 @@
                 <w:color w:val="057A55"/>
                 <w:sz w:val="17"/>
               </w:rPr>
-              <w:t>1</w:t>
+              <w:t>2</w:t>
             </w:r>
           </w:p>
         </w:tc>
@@ -4579,7 +4579,7 @@
                 <w:color w:val="111827"/>
                 <w:sz w:val="17"/>
               </w:rPr>
-              <w:t>/product/code-scanning</w:t>
+              <w:t>/insider/sephora-beauty-insider</w:t>
             </w:r>
           </w:p>
         </w:tc>
@@ -4630,10 +4630,10 @@
             <w:r>
               <w:rPr>
                 <w:b w:val="0"/>
-                <w:color w:val="057A55"/>
-                <w:sz w:val="17"/>
-              </w:rPr>
-              <w:t>1</w:t>
+                <w:color w:val="6B7280"/>
+                <w:sz w:val="17"/>
+              </w:rPr>
+              <w:t>0</w:t>
             </w:r>
           </w:p>
         </w:tc>
@@ -4687,7 +4687,7 @@
                 <w:color w:val="111827"/>
                 <w:sz w:val="17"/>
               </w:rPr>
-              <w:t>3</w:t>
+              <w:t>2</w:t>
             </w:r>
           </w:p>
         </w:tc>
@@ -4743,7 +4743,7 @@
                 <w:color w:val="111827"/>
                 <w:sz w:val="17"/>
               </w:rPr>
-              <w:t>/product/vouchers</w:t>
+              <w:t>/insider/rewards-program-software</w:t>
             </w:r>
           </w:p>
         </w:tc>
@@ -4770,7 +4770,7 @@
                 <w:color w:val="1A56DB"/>
                 <w:sz w:val="17"/>
               </w:rPr>
-              <w:t>1</w:t>
+              <w:t>2</w:t>
             </w:r>
           </w:p>
         </w:tc>
@@ -4794,10 +4794,10 @@
             <w:r>
               <w:rPr>
                 <w:b w:val="0"/>
-                <w:color w:val="057A55"/>
-                <w:sz w:val="17"/>
-              </w:rPr>
-              <w:t>2</w:t>
+                <w:color w:val="6B7280"/>
+                <w:sz w:val="17"/>
+              </w:rPr>
+              <w:t>0</w:t>
             </w:r>
           </w:p>
         </w:tc>
@@ -4851,7 +4851,7 @@
                 <w:color w:val="111827"/>
                 <w:sz w:val="17"/>
               </w:rPr>
-              <w:t>3</w:t>
+              <w:t>2</w:t>
             </w:r>
           </w:p>
         </w:tc>
@@ -4907,7 +4907,7 @@
                 <w:color w:val="111827"/>
                 <w:sz w:val="17"/>
               </w:rPr>
-              <w:t>/insider/sephora-beauty-insider</w:t>
+              <w:t>/product/code-scanning</w:t>
             </w:r>
           </w:p>
         </w:tc>
@@ -4934,7 +4934,7 @@
                 <w:color w:val="1A56DB"/>
                 <w:sz w:val="17"/>
               </w:rPr>
-              <w:t>2</w:t>
+              <w:t>1</w:t>
             </w:r>
           </w:p>
         </w:tc>
@@ -4958,10 +4958,10 @@
             <w:r>
               <w:rPr>
                 <w:b w:val="0"/>
-                <w:color w:val="6B7280"/>
-                <w:sz w:val="17"/>
-              </w:rPr>
-              <w:t>0</w:t>
+                <w:color w:val="057A55"/>
+                <w:sz w:val="17"/>
+              </w:rPr>
+              <w:t>1</w:t>
             </w:r>
           </w:p>
         </w:tc>
@@ -5071,7 +5071,7 @@
                 <w:color w:val="111827"/>
                 <w:sz w:val="17"/>
               </w:rPr>
-              <w:t>/insider/rewards-program-software</w:t>
+              <w:t>/insider/coffee-loyalty-programs-successful-examples</w:t>
             </w:r>
           </w:p>
         </w:tc>
@@ -5098,7 +5098,7 @@
                 <w:color w:val="1A56DB"/>
                 <w:sz w:val="17"/>
               </w:rPr>
-              <w:t>2</w:t>
+              <w:t>1</w:t>
             </w:r>
           </w:p>
         </w:tc>
@@ -5122,10 +5122,10 @@
             <w:r>
               <w:rPr>
                 <w:b w:val="0"/>
-                <w:color w:val="6B7280"/>
-                <w:sz w:val="17"/>
-              </w:rPr>
-              <w:t>0</w:t>
+                <w:color w:val="057A55"/>
+                <w:sz w:val="17"/>
+              </w:rPr>
+              <w:t>1</w:t>
             </w:r>
           </w:p>
         </w:tc>
@@ -5512,7 +5512,7 @@
                 <w:color w:val="1A56DB"/>
                 <w:sz w:val="17"/>
               </w:rPr>
-              <w:t>136</w:t>
+              <w:t>71</w:t>
             </w:r>
           </w:p>
         </w:tc>
@@ -5539,7 +5539,7 @@
                 <w:color w:val="1A56DB"/>
                 <w:sz w:val="17"/>
               </w:rPr>
-              <w:t>97</w:t>
+              <w:t>60</w:t>
             </w:r>
           </w:p>
         </w:tc>
@@ -5566,7 +5566,7 @@
                 <w:color w:val="E02A2A"/>
                 <w:sz w:val="17"/>
               </w:rPr>
-              <w:t>-39</w:t>
+              <w:t>-11</w:t>
             </w:r>
           </w:p>
         </w:tc>
@@ -5595,7 +5595,7 @@
                 <w:color w:val="111827"/>
                 <w:sz w:val="17"/>
               </w:rPr>
-              <w:t>/pricing</w:t>
+              <w:t>/es</w:t>
             </w:r>
           </w:p>
         </w:tc>
@@ -5622,7 +5622,7 @@
                 <w:color w:val="1A56DB"/>
                 <w:sz w:val="17"/>
               </w:rPr>
-              <w:t>21</w:t>
+              <w:t>11</w:t>
             </w:r>
           </w:p>
         </w:tc>
@@ -5649,7 +5649,7 @@
                 <w:color w:val="1A56DB"/>
                 <w:sz w:val="17"/>
               </w:rPr>
-              <w:t>10</w:t>
+              <w:t>3</w:t>
             </w:r>
           </w:p>
         </w:tc>
@@ -5676,7 +5676,7 @@
                 <w:color w:val="E02A2A"/>
                 <w:sz w:val="17"/>
               </w:rPr>
-              <w:t>-11</w:t>
+              <w:t>-8</w:t>
             </w:r>
           </w:p>
         </w:tc>
@@ -5705,7 +5705,7 @@
                 <w:color w:val="111827"/>
                 <w:sz w:val="17"/>
               </w:rPr>
-              <w:t>/book-a-demo-contact</w:t>
+              <w:t>/insider/best-loyalty-software-comparison-guide</w:t>
             </w:r>
           </w:p>
         </w:tc>
@@ -5732,7 +5732,7 @@
                 <w:color w:val="1A56DB"/>
                 <w:sz w:val="17"/>
               </w:rPr>
-              <w:t>19</w:t>
+              <w:t>8</w:t>
             </w:r>
           </w:p>
         </w:tc>
@@ -5759,7 +5759,7 @@
                 <w:color w:val="1A56DB"/>
                 <w:sz w:val="17"/>
               </w:rPr>
-              <w:t>10</w:t>
+              <w:t>3</w:t>
             </w:r>
           </w:p>
         </w:tc>
@@ -5786,7 +5786,7 @@
                 <w:color w:val="E02A2A"/>
                 <w:sz w:val="17"/>
               </w:rPr>
-              <w:t>-9</w:t>
+              <w:t>-5</w:t>
             </w:r>
           </w:p>
         </w:tc>
@@ -5815,7 +5815,7 @@
                 <w:color w:val="111827"/>
                 <w:sz w:val="17"/>
               </w:rPr>
-              <w:t>/es</w:t>
+              <w:t>/applications/white-label-loyalty</w:t>
             </w:r>
           </w:p>
         </w:tc>
@@ -5842,7 +5842,7 @@
                 <w:color w:val="1A56DB"/>
                 <w:sz w:val="17"/>
               </w:rPr>
-              <w:t>13</w:t>
+              <w:t>9</w:t>
             </w:r>
           </w:p>
         </w:tc>
@@ -5869,7 +5869,7 @@
                 <w:color w:val="1A56DB"/>
                 <w:sz w:val="17"/>
               </w:rPr>
-              <w:t>3</w:t>
+              <w:t>2</w:t>
             </w:r>
           </w:p>
         </w:tc>
@@ -5896,7 +5896,7 @@
                 <w:color w:val="E02A2A"/>
                 <w:sz w:val="17"/>
               </w:rPr>
-              <w:t>-10</w:t>
+              <w:t>-7</w:t>
             </w:r>
           </w:p>
         </w:tc>
@@ -5925,7 +5925,7 @@
                 <w:color w:val="111827"/>
                 <w:sz w:val="17"/>
               </w:rPr>
-              <w:t>/applications/white-label-loyalty</w:t>
+              <w:t>/pricing</w:t>
             </w:r>
           </w:p>
         </w:tc>
@@ -5952,7 +5952,7 @@
                 <w:color w:val="1A56DB"/>
                 <w:sz w:val="17"/>
               </w:rPr>
-              <w:t>12</w:t>
+              <w:t>7</w:t>
             </w:r>
           </w:p>
         </w:tc>
@@ -6006,7 +6006,7 @@
                 <w:color w:val="E02A2A"/>
                 <w:sz w:val="17"/>
               </w:rPr>
-              <w:t>-9</w:t>
+              <w:t>-4</w:t>
             </w:r>
           </w:p>
         </w:tc>
@@ -6035,7 +6035,7 @@
                 <w:color w:val="111827"/>
                 <w:sz w:val="17"/>
               </w:rPr>
-              <w:t>/insider/best-loyalty-software-comparison-guide</w:t>
+              <w:t>/technology/loyalty-program-api</w:t>
             </w:r>
           </w:p>
         </w:tc>
@@ -6062,7 +6062,7 @@
                 <w:color w:val="1A56DB"/>
                 <w:sz w:val="17"/>
               </w:rPr>
-              <w:t>9</w:t>
+              <w:t>7</w:t>
             </w:r>
           </w:p>
         </w:tc>
@@ -6089,7 +6089,7 @@
                 <w:color w:val="1A56DB"/>
                 <w:sz w:val="17"/>
               </w:rPr>
-              <w:t>3</w:t>
+              <w:t>2</w:t>
             </w:r>
           </w:p>
         </w:tc>
@@ -6116,7 +6116,7 @@
                 <w:color w:val="E02A2A"/>
                 <w:sz w:val="17"/>
               </w:rPr>
-              <w:t>-6</w:t>
+              <w:t>-5</w:t>
             </w:r>
           </w:p>
         </w:tc>
@@ -6145,7 +6145,7 @@
                 <w:color w:val="111827"/>
                 <w:sz w:val="17"/>
               </w:rPr>
-              <w:t>/technology/loyalty-program-api</w:t>
+              <w:t>/insider/coupon-management-software</w:t>
             </w:r>
           </w:p>
         </w:tc>
@@ -6172,7 +6172,7 @@
                 <w:color w:val="1A56DB"/>
                 <w:sz w:val="17"/>
               </w:rPr>
-              <w:t>7</w:t>
+              <w:t>2</w:t>
             </w:r>
           </w:p>
         </w:tc>
@@ -6199,7 +6199,7 @@
                 <w:color w:val="1A56DB"/>
                 <w:sz w:val="17"/>
               </w:rPr>
-              <w:t>3</w:t>
+              <w:t>2</w:t>
             </w:r>
           </w:p>
         </w:tc>
@@ -6223,10 +6223,10 @@
             <w:r>
               <w:rPr>
                 <w:b/>
-                <w:color w:val="E02A2A"/>
-                <w:sz w:val="17"/>
-              </w:rPr>
-              <w:t>-4</w:t>
+                <w:color w:val="6B7280"/>
+                <w:sz w:val="17"/>
+              </w:rPr>
+              <w:t>0</w:t>
             </w:r>
           </w:p>
         </w:tc>
@@ -6255,7 +6255,7 @@
                 <w:color w:val="111827"/>
                 <w:sz w:val="17"/>
               </w:rPr>
-              <w:t>/product/loyalty-card-system</w:t>
+              <w:t>/resources/10-best-gamification-loyalty-programs</w:t>
             </w:r>
           </w:p>
         </w:tc>
@@ -6365,7 +6365,7 @@
                 <w:color w:val="111827"/>
                 <w:sz w:val="17"/>
               </w:rPr>
-              <w:t>/resources/10-best-gamification-loyalty-programs</w:t>
+              <w:t>/product/vouchers</w:t>
             </w:r>
           </w:p>
         </w:tc>
@@ -6392,7 +6392,7 @@
                 <w:color w:val="1A56DB"/>
                 <w:sz w:val="17"/>
               </w:rPr>
-              <w:t>3</w:t>
+              <w:t>1</w:t>
             </w:r>
           </w:p>
         </w:tc>
@@ -6419,7 +6419,7 @@
                 <w:color w:val="1A56DB"/>
                 <w:sz w:val="17"/>
               </w:rPr>
-              <w:t>1</w:t>
+              <w:t>2</w:t>
             </w:r>
           </w:p>
         </w:tc>
@@ -6443,10 +6443,10 @@
             <w:r>
               <w:rPr>
                 <w:b/>
-                <w:color w:val="E02A2A"/>
-                <w:sz w:val="17"/>
-              </w:rPr>
-              <w:t>-2</w:t>
+                <w:color w:val="057A55"/>
+                <w:sz w:val="17"/>
+              </w:rPr>
+              <w:t>+1</w:t>
             </w:r>
           </w:p>
         </w:tc>
@@ -6475,7 +6475,7 @@
                 <w:color w:val="111827"/>
                 <w:sz w:val="17"/>
               </w:rPr>
-              <w:t>/product/loyalty-points-system</w:t>
+              <w:t>/applications/saas-enrichment</w:t>
             </w:r>
           </w:p>
         </w:tc>
@@ -6502,7 +6502,7 @@
                 <w:color w:val="1A56DB"/>
                 <w:sz w:val="17"/>
               </w:rPr>
-              <w:t>3</w:t>
+              <w:t>2</w:t>
             </w:r>
           </w:p>
         </w:tc>
@@ -6526,10 +6526,10 @@
             <w:r>
               <w:rPr>
                 <w:b w:val="0"/>
-                <w:color w:val="6B7280"/>
-                <w:sz w:val="17"/>
-              </w:rPr>
-              <w:t>0</w:t>
+                <w:color w:val="1A56DB"/>
+                <w:sz w:val="17"/>
+              </w:rPr>
+              <w:t>1</w:t>
             </w:r>
           </w:p>
         </w:tc>
@@ -6556,7 +6556,7 @@
                 <w:color w:val="E02A2A"/>
                 <w:sz w:val="17"/>
               </w:rPr>
-              <w:t>-3</w:t>
+              <w:t>-1</w:t>
             </w:r>
           </w:p>
         </w:tc>

</xml_diff>